<commit_message>
Complete S00_L02 Swerve hardware audit
</commit_message>
<xml_diff>
--- a/docs/Document_A/FRC_Final_Frozen_Backbone_Architecture_Poster.docx
+++ b/docs/Document_A/FRC_Final_Frozen_Backbone_Architecture_Poster.docx
@@ -45,16 +45,8 @@
             </w:tcMar>
           </w:tcPr>
           <w:p>
-            <w:pPr>
-              <w:jc w:val="center"/>
-            </w:pPr>
             <w:r>
-              <w:rPr>
-                <w:b/>
-                <w:color w:val="17365D"/>
-                <w:sz w:val="22"/>
-              </w:rPr>
-              <w:t>Driver -&gt; Xbox Controller -&gt; controls -&gt; commands -&gt; subsystems -&gt; io -&gt; Hardware</w:t>
+              <w:t>CONTROL: Driver -&gt; Xbox Controller -&gt; controls -&gt; commands -&gt; subsystems -&gt; io -&gt; hardware</w:t>
             </w:r>
           </w:p>
         </w:tc>
@@ -72,15 +64,8 @@
             </w:tcMar>
           </w:tcPr>
           <w:p>
-            <w:pPr>
-              <w:jc w:val="center"/>
-            </w:pPr>
             <w:r>
-              <w:rPr>
-                <w:color w:val="227A78"/>
-                <w:sz w:val="18"/>
-              </w:rPr>
-              <w:t>telemetry observes beside the pipeline; it never controls the pipeline</w:t>
+              <w:t>OBSERVATION: hardware -&gt; IOInputs -&gt; subsystem / estimator -&gt; immutable Observation -&gt; telemetry -&gt; NT4 / Glass / log</w:t>
             </w:r>
           </w:p>
         </w:tc>
@@ -105,15 +90,7 @@
             <w:shd w:fill="D9EAF7"/>
           </w:tcPr>
           <w:p>
-            <w:pPr>
-              <w:jc w:val="center"/>
-            </w:pPr>
             <w:r>
-              <w:rPr>
-                <w:b/>
-                <w:color w:val="17365D"/>
-                <w:sz w:val="19"/>
-              </w:rPr>
               <w:t>PACKAGE TREE</w:t>
             </w:r>
           </w:p>
@@ -124,15 +101,7 @@
             <w:shd w:fill="D9EAF7"/>
           </w:tcPr>
           <w:p>
-            <w:pPr>
-              <w:jc w:val="center"/>
-            </w:pPr>
             <w:r>
-              <w:rPr>
-                <w:b/>
-                <w:color w:val="17365D"/>
-                <w:sz w:val="19"/>
-              </w:rPr>
               <w:t>RESPONSIBILITY MAP</w:t>
             </w:r>
           </w:p>
@@ -143,15 +112,7 @@
             <w:shd w:fill="D9EAF7"/>
           </w:tcPr>
           <w:p>
-            <w:pPr>
-              <w:jc w:val="center"/>
-            </w:pPr>
             <w:r>
-              <w:rPr>
-                <w:b/>
-                <w:color w:val="17365D"/>
-                <w:sz w:val="19"/>
-              </w:rPr>
               <w:t>FINAL FROZEN RULES</w:t>
             </w:r>
           </w:p>
@@ -666,23 +627,10 @@
             </w:tcMar>
           </w:tcPr>
           <w:p>
-            <w:pPr>
-              <w:jc w:val="center"/>
-            </w:pPr>
             <w:r>
-              <w:rPr>
-                <w:b/>
-                <w:color w:val="17365D"/>
-                <w:sz w:val="16"/>
-              </w:rPr>
               <w:t>CONTROL</w:t>
               <w:br/>
-            </w:r>
-            <w:r>
-              <w:rPr>
-                <w:sz w:val="14"/>
-              </w:rPr>
-              <w:t>Controller -&gt; controls -&gt; command -&gt; subsystem -&gt; IO -&gt; hardware</w:t>
+              <w:t>Driver -&gt; Xbox Controller -&gt; controls -&gt; commands -&gt; subsystems -&gt; io -&gt; hardware</w:t>
             </w:r>
           </w:p>
         </w:tc>
@@ -698,23 +646,10 @@
             </w:tcMar>
           </w:tcPr>
           <w:p>
-            <w:pPr>
-              <w:jc w:val="center"/>
-            </w:pPr>
             <w:r>
-              <w:rPr>
-                <w:b/>
-                <w:color w:val="17365D"/>
-                <w:sz w:val="16"/>
-              </w:rPr>
               <w:t>OBSERVATION</w:t>
               <w:br/>
-            </w:r>
-            <w:r>
-              <w:rPr>
-                <w:sz w:val="14"/>
-              </w:rPr>
-              <w:t>IO Inputs / mechanism state -&gt; telemetry facade -&gt; typed NT4</w:t>
+              <w:t>hardware -&gt; IOInputs -&gt; subsystem / estimator -&gt; immutable Observation -&gt; telemetry -&gt; typed NT4 / Glass / log</w:t>
             </w:r>
           </w:p>
         </w:tc>
@@ -730,23 +665,12 @@
             </w:tcMar>
           </w:tcPr>
           <w:p>
-            <w:pPr>
-              <w:jc w:val="center"/>
-            </w:pPr>
             <w:r>
-              <w:rPr>
-                <w:b/>
-                <w:color w:val="8B1E2D"/>
-                <w:sz w:val="16"/>
-              </w:rPr>
               <w:t>FORBIDDEN</w:t>
               <w:br/>
-            </w:r>
-            <w:r>
-              <w:rPr>
-                <w:sz w:val="14"/>
-              </w:rPr>
-              <w:t>Telemetry -&gt; control | IO -&gt; NT | RobotContainer -&gt; periodic logic</w:t>
+              <w:t>Observation -&gt; hardware / vendor / NT / scheduler / RobotContainer / mutable state / control</w:t>
+              <w:br/>
+              <w:t>Telemetry -&gt; control | IO -&gt; NT</w:t>
             </w:r>
           </w:p>
         </w:tc>
@@ -757,12 +681,16 @@
         <w:jc w:val="center"/>
       </w:pPr>
       <w:r>
+        <w:t>STATUS: VERSION 1.1 FROZEN - APPROVED 2026-08-01</w:t>
+      </w:r>
+    </w:p>
+    <w:p>
+      <w:pPr/>
+      <w:r>
         <w:rPr>
-          <w:b/>
-          <w:color w:val="8B1E2D"/>
-          <w:sz w:val="19"/>
+          <w:sz w:val="14"/>
         </w:rPr>
-        <w:t>STATUS: FINAL FROZEN AND LOCKED - NO FURTHER BACKBONE CHANGES</w:t>
+        <w:t>REVISION HISTORY: 1.0 (2026-07-18) Initial frozen poster | 1.1 (2026-08-01) APPROVED observation package governance migration</w:t>
       </w:r>
     </w:p>
     <w:sectPr>

</xml_diff>